<commit_message>
docs(day3): record final verification and database blockers
</commit_message>
<xml_diff>
--- a/_day-notes/day-03/UrbanKart_Day3_Implementation_Report.docx
+++ b/_day-notes/day-03/UrbanKart_Day3_Implementation_Report.docx
@@ -1,6 +1,6 @@
 
 <file path=word/document.xml><?xml version="1.0" encoding="utf-8"?>
-<w:document xmlns:ns1="http://schemas.openxmlformats.org/officeDocument/2006/relationships" xmlns:w="http://schemas.openxmlformats.org/wordprocessingml/2006/main">
+<w:document xmlns:r="http://schemas.openxmlformats.org/officeDocument/2006/relationships" xmlns:w="http://schemas.openxmlformats.org/wordprocessingml/2006/main">
   <w:body>
     <w:p>
       <w:pPr>
@@ -747,8 +747,36 @@
         <w:t>Set the intended development database name locally in the root configuration and confirm it is isolated/non-production without sharing the URI. Then run the read-only database audit. Only after transaction support is verified should real rollback and 20 simultaneous final-unit checkout tests run against an isolated test database. Keep catalog import write mode as a separate approval step.</w:t>
       </w:r>
     </w:p>
+    <w:p>
+      <w:pPr>
+        <w:pStyle w:val="Heading1"/>
+      </w:pPr>
+      <w:r>
+        <w:t>14. Final verification gate ? 12 October 2026</w:t>
+      </w:r>
+    </w:p>
+    <w:p>
+      <w:r>
+        <w:t>Checkpoint c1c964e4ede1b39bbb18333e0279291d590818c7 on main matched origin/main before this documentation update. Application startup loads the root .env and calls mongoose.connect(MONGODB_URI) without a dbName override. A metadata-only configuration check found a URI, but no database path, URI dbName option, or separate database-name setting. The URI and credentials were not displayed; MongoDB was not contacted.</w:t>
+      </w:r>
+    </w:p>
+    <w:p>
+      <w:r>
+        <w:t>The intended isolated development/test database is not explicitly confirmed. Read-only audit, rollback integration testing, and the 20-request concurrency test therefore remain NOT VERIFIED. Database name/counts, collections, indexes, validators, Day 1 product count, topology, and transaction support are unknown. No database write or importer write mode ran, and no integration-test script was added without a safely allowlisted test database.</w:t>
+      </w:r>
+    </w:p>
+    <w:p>
+      <w:r>
+        <w:t>Next: select the disposable non-production database and confirm its environment/cluster in the provider dashboard. Set the root .env MONGODB_URI to that exact database path, or make a reviewed configuration change to supply dbName. Verify locally that the selected database and cluster are isolated. Do not share credentials or URI; a name containing dev/test is not sufficient proof.</w:t>
+      </w:r>
+    </w:p>
+    <w:p>
+      <w:r>
+        <w:t>Code review confirms authenticated-user scoping, current Product pricing, guarded stock decrement, session use for stock/order/cart operations, and session end in finally. Product deletion or a stock reduction before checkout causes the guarded update to fail. These are code-level observations only. Concurrent cart edits may race; delayed checkout replay after a new cart is populated is not deduplicated because Order has no persistent idempotency key.</w:t>
+      </w:r>
+    </w:p>
     <w:sectPr>
-      <w:footerReference w:type="default" ns1:id="rId3"/>
+      <w:footerReference w:type="default" r:id="rId3"/>
       <w:pgSz w:w="12240" w:h="15840"/>
       <w:pgMar w:top="900" w:bottom="900" w:left="1000" w:right="1000"/>
     </w:sectPr>

</xml_diff>

<commit_message>
test(db): add gated audit and checkout integration tools
</commit_message>
<xml_diff>
--- a/_day-notes/day-03/UrbanKart_Day3_Implementation_Report.docx
+++ b/_day-notes/day-03/UrbanKart_Day3_Implementation_Report.docx
@@ -491,7 +491,7 @@
         <w:tc>
           <w:p>
             <w:r>
-              <w:t>22 passed, 0 failed; tests are local and database methods are mocked.</w:t>
+              <w:t>34 passed, 0 failed: 12 offline safety tests plus 22 existing mocked/local API tests; live integration not run.</w:t>
             </w:r>
           </w:p>
         </w:tc>
@@ -523,7 +523,7 @@
         <w:tc>
           <w:p>
             <w:r>
-              <w:t>All 18 server JavaScript files passed node --check.</w:t>
+              <w:t>All 24 server JavaScript files passed node --check.</w:t>
             </w:r>
           </w:p>
         </w:tc>
@@ -744,7 +744,7 @@
     </w:p>
     <w:p>
       <w:r>
-        <w:t>Set the intended development database name locally in the root configuration and confirm it is isolated/non-production without sharing the URI. Then run the read-only database audit. Only after transaction support is verified should real rollback and 20 simultaneous final-unit checkout tests run against an isolated test database. Keep catalog import write mode as a separate approval step.</w:t>
+        <w:t>Confirm an isolated Atlas project/cluster. Set root .env values URBANKART_EXPECTED_DB_NAME, URBANKART_DB_ENV=isolated-development, and for tests URBANKART_TEST_DB_NAME plus URBANKART_TXN_TOPOLOGY_CONFIRMED=replicaSet or sharded. Then run the database audit and, after its results and topology are confirmed, the rollback and 20-request tests below. Never share the URI. Import write mode remains a separate approval step.</w:t>
       </w:r>
     </w:p>
     <w:p>
@@ -762,7 +762,7 @@
     </w:p>
     <w:p>
       <w:r>
-        <w:t>The intended isolated development/test database is not explicitly confirmed. Read-only audit, rollback integration testing, and the 20-request concurrency test therefore remain NOT VERIFIED. Database name/counts, collections, indexes, validators, Day 1 product count, topology, and transaction support are unknown. No database write or importer write mode ran, and no integration-test script was added without a safely allowlisted test database.</w:t>
+        <w:t>The intended isolated development/test database is not explicitly confirmed. Read-only audit, rollback integration testing, and the 20-request concurrency test therefore remain NOT VERIFIED. Database name/counts, collections, indexes, validators, Day 1 product count, topology, and transaction support are unknown. No database write or importer write mode ran. Audit and integration entry points have been added but stopped at local preflight; no live database test ran.</w:t>
       </w:r>
     </w:p>
     <w:p>
@@ -773,6 +773,44 @@
     <w:p>
       <w:r>
         <w:t>Code review confirms authenticated-user scoping, current Product pricing, guarded stock decrement, session use for stock/order/cart operations, and session end in finally. Product deletion or a stock reduction before checkout causes the guarded update to fail. These are code-level observations only. Concurrent cart edits may race; delayed checkout replay after a new cart is populated is not deduplicated because Order has no persistent idempotency key.</w:t>
+      </w:r>
+    </w:p>
+    <w:p>
+      <w:pPr>
+        <w:pStyle w:val="Heading1"/>
+      </w:pPr>
+      <w:r>
+        <w:t>15. Database safety tools and offline tests</w:t>
+      </w:r>
+    </w:p>
+    <w:p>
+      <w:r>
+        <w:t>The .env.example lists the gate settings blank by default. The auditDatabaseReadOnly.js entry point requires --confirm-isolated-db &lt;name&gt;, an explicit expected database name, a matching explicit URI database path (a conflicting dbName option is refused), and URBANKART_DB_ENV=isolated-development. The isolation variable is a human assertion and does not prove the Atlas project or cluster. It reads collections, exact counts, validators, indexes, model schema paths, Cart userId index details, hello topology, and build/version metadata. It reports topology- and version-level transaction capability separately from an actual successful transaction. Day 1 names are parsed statically from the destructive seed script; the script is never imported or executed, and matches are only by name.</w:t>
+      </w:r>
+    </w:p>
+    <w:p>
+      <w:r>
+        <w:t>The rollback and concurrency entry points additionally require URBANKART_TEST_DB_NAME to match and URBANKART_TXN_TOPOLOGY_CONFIRMED=replicaSet or sharded before they connect. They verify the hello response against that assertion before creating fixtures. Cleanup is restricted to captured IDs for their unique test users, carts, products, and orders belonging to those users.</w:t>
+      </w:r>
+    </w:p>
+    <w:p>
+      <w:r>
+        <w:t>Commands from server/ (these are now implemented; live execution is still gated): npm run audit:database -- --confirm-isolated-db &lt;database-name&gt;; npm run test:checkout:rollback -- --confirm-test-db &lt;database-name&gt;; npm run test:checkout:concurrency -- --confirm-test-db &lt;database-name&gt;.</w:t>
+      </w:r>
+    </w:p>
+    <w:p>
+      <w:r>
+        <w:t>Offline test result: npm test passes 32 tests. The new tests cover missing/unknown/conflicting database confirmations, missing isolation/test/topology attestations, no connect callback on preflight failure, post-connect database mismatch cleanup, credential-safe errors, topology classification, and static Day 1 name extraction. All three actual entry points were invoked with placeholder confirmations; each refused for missing expected database configuration before connecting. Real rollback, persisted concurrency, and audit metadata remain NOT VERIFIED.</w:t>
+      </w:r>
+    </w:p>
+    <w:p>
+      <w:r>
+        <w:t>The rollback integration test uses a real transaction and stock update, then injects a controlled Order.create failure before order persistence; it verifies reverted stock, absent order, preserved cart, and session release. The concurrency integration test creates 20 disposable users/carts against stock 1, calls the real HTTP checkout route with bounded requests, and checks one 201, nineteen 409 responses, final stock 0, one order, and only the successful cart cleared. These scripts have not been run against MongoDB.</w:t>
+      </w:r>
+    </w:p>
+    <w:p>
+      <w:r>
+        <w:t>The current .env has no explicit database path or expected database assertions. After confirming the Atlas project/cluster is isolated, set URBANKART_EXPECTED_DB_NAME and URBANKART_DB_ENV=isolated-development in root .env, and ensure MONGODB_URI selects the same database. For integration testing also set URBANKART_TEST_DB_NAME and URBANKART_TXN_TOPOLOGY_CONFIRMED based on the Atlas topology view. Database names containing dev/test are not proof of isolation.</w:t>
       </w:r>
     </w:p>
     <w:sectPr>

</xml_diff>

<commit_message>
docs(day3): record failed audit attempt
</commit_message>
<xml_diff>
--- a/_day-notes/day-03/UrbanKart_Day3_Implementation_Report.docx
+++ b/_day-notes/day-03/UrbanKart_Day3_Implementation_Report.docx
@@ -849,6 +849,82 @@
     <w:p>
       <w:r>
         <w:t>Next: rotate the Atlas application-user password in Atlas, update it locally without sharing it, confirm the Atlas project and cluster are isolated and disposable, and configure one explicit database path plus the local safety gate values. Then run the read-only audit first. Run real checkout tests only after reviewing the audit and confirming transaction-capable topology.</w:t>
+      </w:r>
+    </w:p>
+    <w:p>
+      <w:pPr>
+        <w:pStyle w:val="Heading1"/>
+      </w:pPr>
+      <w:r>
+        <w:t>Read-only audit hardening (2026-10-12)</w:t>
+      </w:r>
+    </w:p>
+    <w:p>
+      <w:r>
+        <w:t>Actual starting repository state for this hardening task: main at 2249e5cd682518de406e6d77803ead066b256062, matching origin/main. The tracked working tree was clean before these task changes; the report files were not unstaged at inspection time.</w:t>
+      </w:r>
+    </w:p>
+    <w:p>
+      <w:r>
+        <w:t>The audit connection now explicitly sets autoCreate=false and autoIndex=false. The audit imports only model definitions and safety helpers; model compilation declares schema metadata but does not itself issue database writes while disconnected. With both Mongoose automatic behaviors disabled, the audit uses hello/buildInfo and collection listing, counts, index/validator metadata, and a projected product-name query. It calls no model initialization, syncIndexes, createIndexes, ensureIndexes, seed, or importer write path.</w:t>
+      </w:r>
+    </w:p>
+    <w:p>
+      <w:r>
+        <w:t>Offline tests: npm test passed 36 tests, 0 failed. Added tests verify audit preflight failure does not invoke mongoose.connect and the audit connection passes autoCreate=false and autoIndex=false. These tests verify local control flow/options only; they do not prove live database behavior.</w:t>
+      </w:r>
+    </w:p>
+    <w:p>
+      <w:r>
+        <w:t>Syntax checks passed for 24 JavaScript files. npm ls --depth=0 and npm ls --package-lock-only --depth=0 both passed. git diff --check passed.</w:t>
+      </w:r>
+    </w:p>
+    <w:p>
+      <w:r>
+        <w:t>Redacted local configuration inspection found the URI database path is still a placeholder, and URBANKART_EXPECTED_DB_NAME, URBANKART_DB_ENV, URBANKART_TEST_DB_NAME, and URBANKART_TXN_TOPOLOGY_CONFIRMED are unset. No credential or URI value was printed or changed. The proposed urbankart_day3_verify target was not configured.</w:t>
+      </w:r>
+    </w:p>
+    <w:p>
+      <w:r>
+        <w:t>No MongoDB connection, audit command, checkout integration test, seed, import, or Atlas operation occurred. The existing test database and its 18 products, plus test_int, were not accessed or changed. Integration fixture cleanup remains scoped to captured user, cart, and product IDs, with orders queried only for captured fixture users.</w:t>
+      </w:r>
+    </w:p>
+    <w:p>
+      <w:r>
+        <w:t>At the time of this addendum, the next local configuration action was to set the URI path to /urbankart_day3_verify and set URBANKART_EXPECTED_DB_NAME=urbankart_day3_verify and URBANKART_DB_ENV=isolated-development in the ignored root .env. Do not share the URI. The later audit attempt is recorded below; integration-only settings and commands remain a separate gate.</w:t>
+      </w:r>
+    </w:p>
+    <w:p>
+      <w:pPr>
+        <w:pStyle w:val="Heading1"/>
+      </w:pPr>
+      <w:r>
+        <w:t>Latest read-only audit attempt (2026-10-12)</w:t>
+      </w:r>
+    </w:p>
+    <w:p>
+      <w:r>
+        <w:t>The requested command, npm.cmd run audit:database -- --confirm-isolated-db urbankart_day3_verify, passed local preflight and exited with code 1 after the connection/metadata phase. The script reported: Database audit could not complete; connection or metadata remains unverified.</w:t>
+      </w:r>
+    </w:p>
+    <w:p>
+      <w:r>
+        <w:t>The diagnostic is intentionally generic. It does not establish whether MongoDB accepted the connection or whether a later metadata request failed; the cause is undiagnosed. No verified database name, topology/version, collection counts, indexes, validators, Cart index state, or Day 1 product matches are available.</w:t>
+      </w:r>
+    </w:p>
+    <w:p>
+      <w:r>
+        <w:t>The audit command was attempted, but the audit did not return findings and is not considered successful. No checkout integration tests, seed operations, catalogue imports, or write/index/validator operations were run. The existing test database was not the configured target.</w:t>
+      </w:r>
+    </w:p>
+    <w:p>
+      <w:r>
+        <w:t>Live rollback and concurrency behavior remain unverified. Offline unit tests do not establish Atlas transaction support, persisted rollback, or real concurrent checkout behavior.</w:t>
+      </w:r>
+    </w:p>
+    <w:p>
+      <w:r>
+        <w:t>Current offline checkpoint checks passed: npm test reported 36 passed and 0 failed; syntax checks passed for 24 JavaScript files; npm ls --depth=0 and npm ls --package-lock-only --depth=0 passed. DOCX package and Markdown/DOCX consistency checks are recorded for this report update.</w:t>
       </w:r>
     </w:p>
     <w:sectPr>

</xml_diff>

<commit_message>
docs(day3): record live checkout integration results
</commit_message>
<xml_diff>
--- a/_day-notes/day-03/UrbanKart_Day3_Implementation_Report.docx
+++ b/_day-notes/day-03/UrbanKart_Day3_Implementation_Report.docx
@@ -925,6 +925,70 @@
     <w:p>
       <w:r>
         <w:t>Current offline checkpoint checks passed: npm test reported 36 passed and 0 failed; syntax checks passed for 24 JavaScript files; npm ls --depth=0 and npm ls --package-lock-only --depth=0 passed. DOCX package and Markdown/DOCX consistency checks are recorded for this report update.</w:t>
+      </w:r>
+    </w:p>
+    <w:p>
+      <w:pPr>
+        <w:pStyle w:val="Heading2"/>
+      </w:pPr>
+      <w:r>
+        <w:t>Live checkout integration verification (2026-10-13)</w:t>
+      </w:r>
+    </w:p>
+    <w:p>
+      <w:r>
+        <w:t>The following results were supplied for successful runs against the isolated Atlas database urbankart_day3_verify. The reported topology was replicaSet. These are live database integration scenarios and are distinct from the offline unit/mock suite; they are recorded as supplied results and were not rerun during this documentation follow-up.</w:t>
+      </w:r>
+    </w:p>
+    <w:p>
+      <w:pPr>
+        <w:pStyle w:val="Heading3"/>
+      </w:pPr>
+      <w:r>
+        <w:t>Rollback scenario</w:t>
+      </w:r>
+    </w:p>
+    <w:p>
+      <w:r>
+        <w:t>? Starting stock: 5; stock after rollback: 5.</w:t>
+      </w:r>
+    </w:p>
+    <w:p>
+      <w:r>
+        <w:t>? Failed customer orders persisted: 0; cart items preserved: 1.</w:t>
+      </w:r>
+    </w:p>
+    <w:p>
+      <w:r>
+        <w:t>? The stock update was reached, the order-creation failure was injected, and the session ended: all true.</w:t>
+      </w:r>
+    </w:p>
+    <w:p>
+      <w:pPr>
+        <w:pStyle w:val="Heading3"/>
+      </w:pPr>
+      <w:r>
+        <w:t>Twenty-request concurrency scenario</w:t>
+      </w:r>
+    </w:p>
+    <w:p>
+      <w:r>
+        <w:t>? Concurrent requests: 20; HTTP 201 responses: 1; HTTP 409 responses: 19.</w:t>
+      </w:r>
+    </w:p>
+    <w:p>
+      <w:r>
+        <w:t>? Final stock: 0; orders created: 1.</w:t>
+      </w:r>
+    </w:p>
+    <w:p>
+      <w:r>
+        <w:t>? Successful customer?s cart items: 0; failed customers? carts retained: 19.</w:t>
+      </w:r>
+    </w:p>
+    <w:p>
+      <w:r>
+        <w:t>These outcomes verify the specific rollback and last-unit contention scenarios reported for this isolated replica-set database. They do not establish correctness under every workload or production conditions. Persistent idempotency for delayed replayed checkout requests remains absent. Concurrent cart edits can still race with checkout. Index/validator state and the broader database audit remain unverified. The reported Mongoose deprecation warning was observed during those test runs; the checkout stock update now uses returnDocument: after in place of the deprecated new option. No findOneAndReplace() application call site was identified in the repository, so the source of its reported warning remains undetermined.</w:t>
       </w:r>
     </w:p>
     <w:sectPr>

</xml_diff>